<commit_message>
quiz result auto update
</commit_message>
<xml_diff>
--- a/docs/05_RankUp_Quiz_Business_QA.docx
+++ b/docs/05_RankUp_Quiz_Business_QA.docx
@@ -1736,7 +1736,7 @@
                 <w:sz w:val="17"/>
                 <w:szCs w:val="17"/>
               </w:rPr>
-              <w:t xml:space="preserve">Written on submit when review is not pending (no subjective / review already done).</w:t>
+              <w:t xml:space="preserve">Written on submit when review is not pending (no subjective / review already done). Student UI may still show Results pending until the 1-hour auto-graded delay elapses.</w:t>
             </w:r>
           </w:p>
         </w:tc>
@@ -1777,7 +1777,7 @@
                 <w:sz w:val="17"/>
                 <w:szCs w:val="17"/>
               </w:rPr>
-              <w:t xml:space="preserve">Written on submit when IsReviewRequired and subjective answers exist (IsReviewDone=false).</w:t>
+              <w:t xml:space="preserve">Written on submit when subjective teacher-review answers remain (IsReviewDone=false). Student UI overlays Results pending / Partial results from resultAnnouncedPercent until 100% is announced.</w:t>
             </w:r>
           </w:p>
         </w:tc>
@@ -8571,7 +8571,7 @@
                 <w:sz w:val="17"/>
                 <w:szCs w:val="17"/>
               </w:rPr>
-              <w:t xml:space="preserve">This student’s attempt is Submitted and subjective review is pending (IsReviewDone=false).</w:t>
+              <w:t xml:space="preserve">This student’s attempt is Submitted and subjective review is pending (IsReviewDone=false). Student list/detail overlay this with Results pending or Partial results until announced percent is 100.</w:t>
             </w:r>
           </w:p>
         </w:tc>
@@ -8627,7 +8627,7 @@
                 <w:sz w:val="17"/>
                 <w:szCs w:val="17"/>
               </w:rPr>
-              <w:t xml:space="preserve">This student’s attempt cycle is done (submitted and, if required, reviewed).</w:t>
+              <w:t xml:space="preserve">This student’s attempt cycle is done (submitted and, if required, reviewed). Student UI uses this label at 100% announced (or Reviewed after finalize).</w:t>
             </w:r>
           </w:p>
         </w:tc>
@@ -9819,7 +9819,7 @@
                 <w:sz w:val="17"/>
                 <w:szCs w:val="17"/>
               </w:rPr>
-              <w:t xml:space="preserve">Full results after submit (or after teacher review when IsReviewRequired). ReviewDisplayMode modes are retired.</w:t>
+              <w:t xml:space="preserve">Auto-graded questions (known correct answer already on the item) announce 1 hour after quiz completion (later of submit and assignment EndDateTime). Teacher-review questions stay pending until finalize. List/detail/result show resultAnnouncedPercent. ReviewDisplayMode modes are retired.</w:t>
             </w:r>
           </w:p>
         </w:tc>
@@ -12300,7 +12300,92 @@
           <w:sz w:val="21"/>
           <w:szCs w:val="21"/>
         </w:rPr>
-        <w:t xml:space="preserve">Score masking uses QuizReviewDisplay.Resolve on submit and get-result (Full when review is done / not required; hidden while IsReviewRequired and not IsReviewDone).</w:t>
+        <w:t xml:space="preserve">Quiz completion = later of student SubmittedAt and assignment EndDateTime. Auto-graded questions (known correct answer already on the item: MCQ, T/F, multi-select, matching, ordering, media, fill-blank) announce 1 hour after that (QuizReviewDisplay.ObjectiveAnnouncementDelayHours = 1). Early submitters do not see answers while the window is still open.</w:t>
+      </w:r>
+    </w:p>
+    <w:p>
+      <w:pPr>
+        <w:pStyle w:val="ListParagraph"/>
+        <w:numPr>
+          <w:ilvl w:val="0"/>
+          <w:numId w:val="1"/>
+        </w:numPr>
+        <w:spacing w:after="60"/>
+      </w:pPr>
+      <w:r>
+        <w:rPr>
+          <w:sz w:val="21"/>
+          <w:szCs w:val="21"/>
+        </w:rPr>
+        <w:t xml:space="preserve">Teacher-review questions (Descriptive, File Upload) stay pending until finalize (IsReviewDone). The 1-hour delay does not announce them.</w:t>
+      </w:r>
+    </w:p>
+    <w:p>
+      <w:pPr>
+        <w:pStyle w:val="ListParagraph"/>
+        <w:numPr>
+          <w:ilvl w:val="0"/>
+          <w:numId w:val="1"/>
+        </w:numPr>
+        <w:spacing w:after="60"/>
+      </w:pPr>
+      <w:r>
+        <w:rPr>
+          <w:sz w:val="21"/>
+          <w:szCs w:val="21"/>
+        </w:rPr>
+        <w:t xml:space="preserve">Announced percent = marks of announced questions / total marks (not the student’s score %). Exposed as resultAnnouncedPercent on list, detail, and attempt result. Show it with the quiz (e.g. 70% results announced).</w:t>
+      </w:r>
+    </w:p>
+    <w:p>
+      <w:pPr>
+        <w:pStyle w:val="ListParagraph"/>
+        <w:numPr>
+          <w:ilvl w:val="0"/>
+          <w:numId w:val="1"/>
+        </w:numPr>
+        <w:spacing w:after="60"/>
+      </w:pPr>
+      <w:r>
+        <w:rPr>
+          <w:sz w:val="21"/>
+          <w:szCs w:val="21"/>
+        </w:rPr>
+        <w:t xml:space="preserve">Student-facing status overlay: 0% → Results pending; 1–99% → Partial results; 100% → Completed or Reviewed. Stored QuizResultStatus on submit remains Under Review or Completed.</w:t>
+      </w:r>
+    </w:p>
+    <w:p>
+      <w:pPr>
+        <w:pStyle w:val="ListParagraph"/>
+        <w:numPr>
+          <w:ilvl w:val="0"/>
+          <w:numId w:val="1"/>
+        </w:numPr>
+        <w:spacing w:after="60"/>
+      </w:pPr>
+      <w:r>
+        <w:rPr>
+          <w:sz w:val="21"/>
+          <w:szCs w:val="21"/>
+        </w:rPr>
+        <w:t xml:space="preserve">Per-question ResultPending hides marks, correctness, correct answers, and explanations until that question is announced. List/detail hide resultPercent until announced percent is 100.</w:t>
+      </w:r>
+    </w:p>
+    <w:p>
+      <w:pPr>
+        <w:pStyle w:val="ListParagraph"/>
+        <w:numPr>
+          <w:ilvl w:val="0"/>
+          <w:numId w:val="1"/>
+        </w:numPr>
+        <w:spacing w:after="60"/>
+      </w:pPr>
+      <w:r>
+        <w:rPr>
+          <w:sz w:val="21"/>
+          <w:szCs w:val="21"/>
+        </w:rPr>
+        <w:t xml:space="preserve">QuizReviewDisplay.Resolve applies on submit, get-result, list, and detail. It replaces the old all-or-nothing hide of every score while IsReviewRequired.</w:t>
       </w:r>
     </w:p>
     <w:p>
@@ -12435,7 +12520,7 @@
           <w:sz w:val="21"/>
           <w:szCs w:val="21"/>
         </w:rPr>
-        <w:t xml:space="preserve">Results masked while review pending; otherwise Full.</w:t>
+        <w:t xml:space="preserve">Student/parent results: auto-graded questions announce 1 hour after quiz completion; teacher-review questions stay pending until finalize. Show resultAnnouncedPercent with the quiz.</w:t>
       </w:r>
     </w:p>
     <w:p>
@@ -13230,7 +13315,7 @@
                 <w:sz w:val="17"/>
                 <w:szCs w:val="17"/>
               </w:rPr>
-              <w:t xml:space="preserve">Student submit + auto-score; IsAutoSubmit → AutoSubmitted; shared Full / review-pending mask.</w:t>
+              <w:t xml:space="preserve">Student submit + auto-score; IsAutoSubmit → AutoSubmitted; delayed auto-graded announcement (1 hour after completion) + per-question ResultPending.</w:t>
             </w:r>
           </w:p>
         </w:tc>
@@ -13286,7 +13371,7 @@
                 <w:sz w:val="17"/>
                 <w:szCs w:val="17"/>
               </w:rPr>
-              <w:t xml:space="preserve">Student own or Parent linked child; same mask rule as submit.</w:t>
+              <w:t xml:space="preserve">Student own or Parent linked child; same announcement rule as submit (resultAnnouncedPercent, resultsAnnounceAt, ResultPending).</w:t>
             </w:r>
           </w:p>
         </w:tc>
@@ -14115,7 +14200,7 @@
           <w:sz w:val="24"/>
           <w:szCs w:val="24"/>
         </w:rPr>
-        <w:t xml:space="preserve">QZ-09 — Auto-score objective + mask subjective</w:t>
+        <w:t xml:space="preserve">QZ-09 — Auto-score objective + delayed announce; subjective stays pending</w:t>
       </w:r>
     </w:p>
     <w:p>
@@ -14127,7 +14212,7 @@
           <w:sz w:val="21"/>
           <w:szCs w:val="21"/>
         </w:rPr>
-        <w:t xml:space="preserve">Steps: Quiz IsReviewRequired with Fill(AllowTeacherReview) answers; student submits then reloads result.</w:t>
+        <w:t xml:space="preserve">Steps: Quiz with auto-graded items plus Descriptive/File Upload; student submits then reloads result before and after the delay.</w:t>
       </w:r>
     </w:p>
     <w:p>
@@ -14147,7 +14232,7 @@
           <w:sz w:val="21"/>
           <w:szCs w:val="21"/>
         </w:rPr>
-        <w:t xml:space="preserve">Expected: Objective items scored; submit and get-result both use QuizReviewDisplay.Resolve — Pending Review until finalize when IsReviewRequired.</w:t>
+        <w:t xml:space="preserve">Expected: Until 1 hour after quiz completion (later of submit and EndDateTime), announced percent is 0 and all results stay pending. After the delay, auto-graded questions announce; teacher-review questions stay ResultPending until finalize. List/detail show resultAnnouncedPercent; full resultPercent stays hidden until 100%.</w:t>
       </w:r>
     </w:p>
     <w:p>
@@ -14195,7 +14280,7 @@
           <w:sz w:val="21"/>
           <w:szCs w:val="21"/>
         </w:rPr>
-        <w:t xml:space="preserve">Expected: Attempt→Reviewed; IsReviewDone=true; student/parent see full scores/answers once review is done.</w:t>
+        <w:t xml:space="preserve">Expected: Attempt→Reviewed; IsReviewDone=true; announced percent becomes 100%; student/parent see full scores/answers including previously pending teacher-review questions.</w:t>
       </w:r>
     </w:p>
     <w:p>
@@ -15064,6 +15149,54 @@
     </w:p>
     <w:p>
       <w:pPr>
+        <w:pStyle w:val="Heading2"/>
+        <w:spacing w:after="100" w:before="220"/>
+      </w:pPr>
+      <w:r>
+        <w:rPr>
+          <w:b/>
+          <w:bCs/>
+          <w:color w:val="2563EB"/>
+          <w:sz w:val="24"/>
+          <w:szCs w:val="24"/>
+        </w:rPr>
+        <w:t xml:space="preserve">QZ-24 — Early submit waits for window end plus 1 hour</w:t>
+      </w:r>
+    </w:p>
+    <w:p>
+      <w:pPr>
+        <w:spacing w:after="100"/>
+      </w:pPr>
+      <w:r>
+        <w:rPr>
+          <w:sz w:val="21"/>
+          <w:szCs w:val="21"/>
+        </w:rPr>
+        <w:t xml:space="preserve">Steps: Student submits a mixed quiz 30 minutes before assignment EndDateTime, then opens the result immediately and again after EndDateTime + 1 hour (review not finalized).</w:t>
+      </w:r>
+    </w:p>
+    <w:p>
+      <w:pPr>
+        <w:spacing w:after="100"/>
+        <w:rPr>
+          <w:b/>
+          <w:bCs/>
+          <w:color w:val="166534"/>
+        </w:rPr>
+      </w:pPr>
+      <w:r>
+        <w:rPr>
+          <w:b/>
+          <w:bCs/>
+          <w:color w:val="166534"/>
+          <w:sz w:val="21"/>
+          <w:szCs w:val="21"/>
+        </w:rPr>
+        <w:t xml:space="preserve">Expected: Immediate result: Results pending, 0% announced, no correct answers. After End + 1 hour: auto-graded share announces (Partial results if subjective marks remain); descriptive/file stay pending; student score still hidden until 100% announced or teacher finalize.</w:t>
+      </w:r>
+    </w:p>
+    <w:p>
+      <w:pPr>
         <w:pStyle w:val="Heading1"/>
         <w:spacing w:after="100" w:before="220"/>
       </w:pPr>
@@ -15500,7 +15633,7 @@
           <w:sz w:val="21"/>
           <w:szCs w:val="21"/>
         </w:rPr>
-        <w:t xml:space="preserve">☐ QuizResultStatus is per student (Up Coming / Not Attempted / In Progress / Under Review / Expired / Completed) — student list prefers DB name over calculator.</w:t>
+        <w:t xml:space="preserve">☐ QuizResultStatus is per student (Up Coming / Not Attempted / In Progress / Under Review / Expired / Completed). Student list/detail overlay Results pending / Partial results from resultAnnouncedPercent until 100% is announced.</w:t>
       </w:r>
     </w:p>
     <w:p>
@@ -15704,7 +15837,7 @@
           <w:sz w:val="21"/>
           <w:szCs w:val="21"/>
         </w:rPr>
-        <w:t xml:space="preserve">☐ Shared Full / review-pending mask on submit and get-result until finalize when required.</w:t>
+        <w:t xml:space="preserve">☐ After submit, auto-graded results announce 1 hour after quiz completion (later of submit and assignment end). Teacher-review questions stay pending until finalize. Show resultAnnouncedPercent with the quiz.</w:t>
       </w:r>
     </w:p>
     <w:p>

</xml_diff>